<commit_message>
docs: arquivos aula 4
</commit_message>
<xml_diff>
--- a/Aula4/Apostila_ES6_ECMAScript6.docx
+++ b/Aula4/Apostila_ES6_ECMAScript6.docx
@@ -357,6 +357,11 @@
                 <w:rStyle w:val="Vnculodendice"/>
               </w:rPr>
               <w:t>0. Introdução ao JavaScript</w:t>
+            </w:r>
+            <w:r>
+              <w:rPr>
+                <w:rStyle w:val="Vnculodendice"/>
+              </w:rPr>
               <w:tab/>
               <w:t>3</w:t>
             </w:r>
@@ -978,7 +983,7 @@
               </w:rPr>
               <w:t>12. Promises</w:t>
               <w:tab/>
-              <w:t>22</w:t>
+              <w:t>21</w:t>
             </w:r>
           </w:hyperlink>
         </w:p>
@@ -998,7 +1003,7 @@
               </w:rPr>
               <w:t>12.1. Estados de uma Promise</w:t>
               <w:tab/>
-              <w:t>22</w:t>
+              <w:t>21</w:t>
             </w:r>
           </w:hyperlink>
         </w:p>
@@ -1018,7 +1023,7 @@
               </w:rPr>
               <w:t>12.2. Criando e Consumindo Promises</w:t>
               <w:tab/>
-              <w:t>22</w:t>
+              <w:t>21</w:t>
             </w:r>
           </w:hyperlink>
         </w:p>
@@ -1038,7 +1043,7 @@
               </w:rPr>
               <w:t>12.3. Async / Await (ES2017 — baseado em Promises)</w:t>
               <w:tab/>
-              <w:t>23</w:t>
+              <w:t>22</w:t>
             </w:r>
           </w:hyperlink>
         </w:p>
@@ -1058,7 +1063,7 @@
               </w:rPr>
               <w:t>13. Iteradores e Generators</w:t>
               <w:tab/>
-              <w:t>24</w:t>
+              <w:t>23</w:t>
             </w:r>
           </w:hyperlink>
         </w:p>
@@ -1078,7 +1083,7 @@
               </w:rPr>
               <w:t>13.1. for...of</w:t>
               <w:tab/>
-              <w:t>24</w:t>
+              <w:t>23</w:t>
             </w:r>
           </w:hyperlink>
         </w:p>
@@ -1098,7 +1103,7 @@
               </w:rPr>
               <w:t>13.2. Generator Functions</w:t>
               <w:tab/>
-              <w:t>24</w:t>
+              <w:t>23</w:t>
             </w:r>
           </w:hyperlink>
         </w:p>
@@ -1118,7 +1123,7 @@
               </w:rPr>
               <w:t>14. Map e Set</w:t>
               <w:tab/>
-              <w:t>25</w:t>
+              <w:t>24</w:t>
             </w:r>
           </w:hyperlink>
         </w:p>
@@ -1138,7 +1143,7 @@
               </w:rPr>
               <w:t>14.1. Map</w:t>
               <w:tab/>
-              <w:t>25</w:t>
+              <w:t>24</w:t>
             </w:r>
           </w:hyperlink>
         </w:p>
@@ -1158,7 +1163,7 @@
               </w:rPr>
               <w:t>14.2. Set</w:t>
               <w:tab/>
-              <w:t>25</w:t>
+              <w:t>24</w:t>
             </w:r>
           </w:hyperlink>
         </w:p>
@@ -1178,7 +1183,7 @@
               </w:rPr>
               <w:t>15. Symbol</w:t>
               <w:tab/>
-              <w:t>27</w:t>
+              <w:t>26</w:t>
             </w:r>
           </w:hyperlink>
         </w:p>
@@ -1198,27 +1203,7 @@
               </w:rPr>
               <w:t>16. Proxy e Reflect</w:t>
               <w:tab/>
-              <w:t>27</w:t>
-            </w:r>
-          </w:hyperlink>
-        </w:p>
-        <w:p>
-          <w:pPr>
-            <w:pStyle w:val="TOC1"/>
-            <w:tabs>
-              <w:tab w:val="clear" w:pos="9346"/>
-              <w:tab w:val="right" w:pos="9345" w:leader="dot"/>
-            </w:tabs>
-            <w:rPr/>
-          </w:pPr>
-          <w:hyperlink w:anchor="__RefHeading___Toc3596_503637031">
-            <w:r>
-              <w:rPr>
-                <w:rStyle w:val="Vnculodendice"/>
-              </w:rPr>
-              <w:t>18. Exercícios Práticos</w:t>
-              <w:tab/>
-              <w:t>29</w:t>
+              <w:t>26</w:t>
             </w:r>
           </w:hyperlink>
         </w:p>
@@ -1236,9 +1221,9 @@
               <w:rPr>
                 <w:rStyle w:val="Vnculodendice"/>
               </w:rPr>
-              <w:t>20. Referências e Leituras Complementares</w:t>
+              <w:t>17. Referências e Leituras Complementares</w:t>
               <w:tab/>
-              <w:t>30</w:t>
+              <w:t>28</w:t>
             </w:r>
           </w:hyperlink>
         </w:p>
@@ -1258,7 +1243,7 @@
               </w:rPr>
               <w:t>Documentação Oficial</w:t>
               <w:tab/>
-              <w:t>30</w:t>
+              <w:t>28</w:t>
             </w:r>
           </w:hyperlink>
         </w:p>
@@ -1278,7 +1263,7 @@
               </w:rPr>
               <w:t>Livros Recomendados</w:t>
               <w:tab/>
-              <w:t>30</w:t>
+              <w:t>28</w:t>
             </w:r>
           </w:hyperlink>
         </w:p>
@@ -1298,7 +1283,7 @@
               </w:rPr>
               <w:t>Ferramentas e Ambientes de Prática</w:t>
               <w:tab/>
-              <w:t>30</w:t>
+              <w:t>28</w:t>
             </w:r>
           </w:hyperlink>
         </w:p>
@@ -1318,7 +1303,7 @@
               </w:rPr>
               <w:t>Cursos e Tutoriais Online</w:t>
               <w:tab/>
-              <w:t>30</w:t>
+              <w:t>28</w:t>
             </w:r>
           </w:hyperlink>
           <w:r>
@@ -1395,23 +1380,7 @@
           <w:sz w:val="22"/>
           <w:szCs w:val="22"/>
         </w:rPr>
-        <w:t xml:space="preserve">Antes de </w:t>
-      </w:r>
-      <w:r>
-        <w:rPr>
-          <w:rFonts w:eastAsia="Arial" w:cs="Arial"/>
-          <w:sz w:val="22"/>
-          <w:szCs w:val="22"/>
-        </w:rPr>
-        <w:t>ver as novidades do</w:t>
-      </w:r>
-      <w:r>
-        <w:rPr>
-          <w:rFonts w:eastAsia="Arial" w:cs="Arial"/>
-          <w:sz w:val="22"/>
-          <w:szCs w:val="22"/>
-        </w:rPr>
-        <w:t xml:space="preserve"> ECMAScript 6, é essencial entender o que é o JavaScript, como ele funciona e por que se tornou a linguagem mais utilizada no desenvolvimento web moderno.</w:t>
+        <w:t>Antes de ver as novidades do ECMAScript 6, é essencial entender o que é o JavaScript, como ele funciona e por que se tornou a linguagem mais utilizada no desenvolvimento web moderno.</w:t>
       </w:r>
     </w:p>
     <w:p>
@@ -2027,7 +1996,7 @@
         <w:pStyle w:val="ListParagraph"/>
         <w:numPr>
           <w:ilvl w:val="0"/>
-          <w:numId w:val="2"/>
+          <w:numId w:val="1"/>
         </w:numPr>
         <w:spacing w:before="40" w:after="60"/>
         <w:rPr/>
@@ -2046,7 +2015,7 @@
         <w:pStyle w:val="ListParagraph"/>
         <w:numPr>
           <w:ilvl w:val="0"/>
-          <w:numId w:val="2"/>
+          <w:numId w:val="1"/>
         </w:numPr>
         <w:spacing w:before="40" w:after="60"/>
         <w:rPr/>
@@ -2065,7 +2034,7 @@
         <w:pStyle w:val="ListParagraph"/>
         <w:numPr>
           <w:ilvl w:val="0"/>
-          <w:numId w:val="2"/>
+          <w:numId w:val="1"/>
         </w:numPr>
         <w:spacing w:before="40" w:after="60"/>
         <w:rPr/>
@@ -2084,7 +2053,7 @@
         <w:pStyle w:val="ListParagraph"/>
         <w:numPr>
           <w:ilvl w:val="0"/>
-          <w:numId w:val="2"/>
+          <w:numId w:val="1"/>
         </w:numPr>
         <w:spacing w:before="40" w:after="60"/>
         <w:rPr/>
@@ -2103,7 +2072,7 @@
         <w:pStyle w:val="ListParagraph"/>
         <w:numPr>
           <w:ilvl w:val="0"/>
-          <w:numId w:val="2"/>
+          <w:numId w:val="1"/>
         </w:numPr>
         <w:spacing w:before="40" w:after="60"/>
         <w:rPr/>
@@ -2122,7 +2091,7 @@
         <w:pStyle w:val="ListParagraph"/>
         <w:numPr>
           <w:ilvl w:val="0"/>
-          <w:numId w:val="2"/>
+          <w:numId w:val="1"/>
         </w:numPr>
         <w:spacing w:before="40" w:after="60"/>
         <w:rPr/>
@@ -5982,7 +5951,7 @@
           <w:sz w:val="22"/>
           <w:szCs w:val="22"/>
         </w:rPr>
-        <w:t>Resolvia limitações graves do var (escopo de função, hoisting inesperado)</w:t>
+        <w:t>Resolvia limitações graves do var (escopo de função, hoisting [içamento de variáveis para o top do arquivo] inesperado)</w:t>
       </w:r>
     </w:p>
     <w:p>
@@ -5990,7 +5959,7 @@
         <w:pStyle w:val="ListParagraph"/>
         <w:numPr>
           <w:ilvl w:val="0"/>
-          <w:numId w:val="2"/>
+          <w:numId w:val="1"/>
         </w:numPr>
         <w:spacing w:before="40" w:after="60"/>
         <w:rPr/>
@@ -9063,7 +9032,12 @@
             <w:pPr>
               <w:pStyle w:val="Normal"/>
               <w:spacing w:before="0" w:after="0"/>
-              <w:rPr/>
+              <w:rPr>
+                <w:rFonts w:ascii="Courier New" w:hAnsi="Courier New" w:eastAsia="Courier New" w:cs="Courier New"/>
+                <w:color w:val="D4D4D4"/>
+                <w:sz w:val="18"/>
+                <w:szCs w:val="18"/>
+              </w:rPr>
             </w:pPr>
             <w:r>
               <w:rPr>
@@ -15169,9 +15143,6 @@
           <w:szCs w:val="22"/>
         </w:rPr>
       </w:r>
-      <w:r>
-        <w:br w:type="page"/>
-      </w:r>
     </w:p>
     <w:p>
       <w:pPr>
@@ -15180,7 +15151,41 @@
           <w:bottom w:val="single" w:sz="8" w:space="4" w:color="2E75B6"/>
         </w:pBdr>
         <w:spacing w:before="0" w:after="200"/>
-        <w:rPr/>
+        <w:rPr>
+          <w:rFonts w:eastAsia="Arial" w:cs="Arial"/>
+          <w:b/>
+          <w:bCs/>
+          <w:color w:val="1A3A5C"/>
+          <w:sz w:val="36"/>
+          <w:szCs w:val="36"/>
+        </w:rPr>
+      </w:pPr>
+      <w:r>
+        <w:rPr>
+          <w:rFonts w:eastAsia="Arial" w:cs="Arial"/>
+          <w:b/>
+          <w:bCs/>
+          <w:color w:val="1A3A5C"/>
+          <w:sz w:val="36"/>
+          <w:szCs w:val="36"/>
+        </w:rPr>
+      </w:r>
+    </w:p>
+    <w:p>
+      <w:pPr>
+        <w:pStyle w:val="Heading1"/>
+        <w:pBdr>
+          <w:bottom w:val="single" w:sz="8" w:space="4" w:color="2E75B6"/>
+        </w:pBdr>
+        <w:spacing w:before="0" w:after="200"/>
+        <w:rPr>
+          <w:rFonts w:eastAsia="Arial" w:cs="Arial"/>
+          <w:b/>
+          <w:bCs/>
+          <w:color w:val="1A3A5C"/>
+          <w:sz w:val="36"/>
+          <w:szCs w:val="36"/>
+        </w:rPr>
       </w:pPr>
       <w:bookmarkStart w:id="31" w:name="__RefHeading___Toc3570_503637031"/>
       <w:bookmarkEnd w:id="31"/>
@@ -20762,7 +20767,7 @@
         <w:spacing w:before="0" w:after="200"/>
         <w:rPr/>
       </w:pPr>
-      <w:bookmarkStart w:id="43" w:name="__RefHeading___Toc3596_503637031"/>
+      <w:bookmarkStart w:id="43" w:name="__RefHeading___Toc3616_503637031"/>
       <w:bookmarkEnd w:id="43"/>
       <w:r>
         <w:rPr>
@@ -20773,97 +20778,17 @@
           <w:sz w:val="36"/>
           <w:szCs w:val="36"/>
         </w:rPr>
-        <w:t>18. Exercícios Práticos</w:t>
+        <w:t>17. Referências e Leituras Complementares</w:t>
       </w:r>
     </w:p>
     <w:p>
       <w:pPr>
-        <w:pStyle w:val="Normal"/>
-        <w:rPr/>
-      </w:pPr>
-      <w:r>
-        <w:rPr>
-          <w:rFonts w:eastAsia="Arial" w:cs="Arial"/>
-          <w:sz w:val="22"/>
-          <w:szCs w:val="22"/>
-        </w:rPr>
-        <w:t xml:space="preserve"> </w:t>
-      </w:r>
-      <w:r>
-        <w:rPr>
-          <w:rFonts w:eastAsia="Arial" w:cs="Arial"/>
-          <w:b/>
-          <w:bCs/>
-          <w:color w:val="2E75B6"/>
-          <w:sz w:val="28"/>
-          <w:szCs w:val="28"/>
-        </w:rPr>
-        <w:t>Exercício 1</w:t>
-      </w:r>
-    </w:p>
-    <w:p>
-      <w:pPr>
-        <w:pStyle w:val="Normal"/>
-        <w:spacing w:before="80" w:after="120"/>
-        <w:rPr/>
-      </w:pPr>
-      <w:r>
-        <w:rPr>
-          <w:rFonts w:eastAsia="Arial" w:cs="Arial"/>
-          <w:sz w:val="22"/>
-          <w:szCs w:val="22"/>
-        </w:rPr>
-        <w:t>Vamos transformar o código javascript do nosso projeto em typescript.</w:t>
-      </w:r>
-      <w:r>
-        <w:br w:type="page"/>
-      </w:r>
-    </w:p>
-    <w:p>
-      <w:pPr>
-        <w:pStyle w:val="Heading1"/>
-        <w:pBdr>
-          <w:bottom w:val="single" w:sz="8" w:space="4" w:color="2E75B6"/>
-        </w:pBdr>
-        <w:spacing w:before="0" w:after="200"/>
-        <w:rPr/>
-      </w:pPr>
-      <w:bookmarkStart w:id="44" w:name="__RefHeading___Toc3616_503637031"/>
-      <w:bookmarkEnd w:id="44"/>
-      <w:r>
-        <w:rPr>
-          <w:rFonts w:eastAsia="Arial" w:cs="Arial"/>
-          <w:b/>
-          <w:bCs/>
-          <w:color w:val="1A3A5C"/>
-          <w:sz w:val="36"/>
-          <w:szCs w:val="36"/>
-        </w:rPr>
-        <w:t>20. Referências e Leituras Complementares</w:t>
-      </w:r>
-    </w:p>
-    <w:p>
-      <w:pPr>
-        <w:pStyle w:val="Normal"/>
-        <w:rPr/>
-      </w:pPr>
-      <w:r>
-        <w:rPr>
-          <w:rFonts w:eastAsia="Arial" w:cs="Arial"/>
-          <w:sz w:val="22"/>
-          <w:szCs w:val="22"/>
-        </w:rPr>
-        <w:t xml:space="preserve"> </w:t>
-      </w:r>
-    </w:p>
-    <w:p>
-      <w:pPr>
         <w:pStyle w:val="Heading2"/>
         <w:spacing w:before="300" w:after="150"/>
         <w:rPr/>
       </w:pPr>
-      <w:bookmarkStart w:id="45" w:name="__RefHeading___Toc3618_503637031"/>
-      <w:bookmarkEnd w:id="45"/>
+      <w:bookmarkStart w:id="44" w:name="__RefHeading___Toc3618_503637031"/>
+      <w:bookmarkEnd w:id="44"/>
       <w:r>
         <w:rPr>
           <w:rFonts w:eastAsia="Arial" w:cs="Arial"/>
@@ -20953,8 +20878,8 @@
         <w:spacing w:before="300" w:after="150"/>
         <w:rPr/>
       </w:pPr>
-      <w:bookmarkStart w:id="46" w:name="__RefHeading___Toc3620_503637031"/>
-      <w:bookmarkEnd w:id="46"/>
+      <w:bookmarkStart w:id="45" w:name="__RefHeading___Toc3620_503637031"/>
+      <w:bookmarkEnd w:id="45"/>
       <w:r>
         <w:rPr>
           <w:rFonts w:eastAsia="Arial" w:cs="Arial"/>
@@ -21063,8 +20988,8 @@
         <w:spacing w:before="300" w:after="150"/>
         <w:rPr/>
       </w:pPr>
-      <w:bookmarkStart w:id="47" w:name="__RefHeading___Toc3622_503637031"/>
-      <w:bookmarkEnd w:id="47"/>
+      <w:bookmarkStart w:id="46" w:name="__RefHeading___Toc3622_503637031"/>
+      <w:bookmarkEnd w:id="46"/>
       <w:r>
         <w:rPr>
           <w:rFonts w:eastAsia="Arial" w:cs="Arial"/>
@@ -21192,8 +21117,8 @@
         <w:spacing w:before="300" w:after="150"/>
         <w:rPr/>
       </w:pPr>
-      <w:bookmarkStart w:id="48" w:name="__RefHeading___Toc3624_503637031"/>
-      <w:bookmarkEnd w:id="48"/>
+      <w:bookmarkStart w:id="47" w:name="__RefHeading___Toc3624_503637031"/>
+      <w:bookmarkEnd w:id="47"/>
       <w:r>
         <w:rPr>
           <w:rFonts w:eastAsia="Arial" w:cs="Arial"/>
@@ -21622,7 +21547,7 @@
     </w:r>
     <w:r>
       <w:rPr/>
-      <w:t>31</w:t>
+      <w:t>14</w:t>
     </w:r>
     <w:r>
       <w:rPr/>
@@ -21651,7 +21576,7 @@
     </w:r>
     <w:r>
       <w:rPr/>
-      <w:t>31</w:t>
+      <w:t>28</w:t>
     </w:r>
     <w:r>
       <w:rPr/>
@@ -21695,7 +21620,7 @@
     </w:r>
     <w:r>
       <w:rPr/>
-      <w:t>31</w:t>
+      <w:t>14</w:t>
     </w:r>
     <w:r>
       <w:rPr/>
@@ -21724,7 +21649,7 @@
     </w:r>
     <w:r>
       <w:rPr/>
-      <w:t>31</w:t>
+      <w:t>28</w:t>
     </w:r>
     <w:r>
       <w:rPr/>
@@ -24661,67 +24586,67 @@
     <w:abstractNumId w:val="22"/>
   </w:num>
   <w:num w:numId="23">
-    <w:abstractNumId w:val="2"/>
+    <w:abstractNumId w:val="1"/>
     <w:lvlOverride w:ilvl="0">
       <w:startOverride w:val="1"/>
     </w:lvlOverride>
   </w:num>
   <w:num w:numId="24">
-    <w:abstractNumId w:val="2"/>
+    <w:abstractNumId w:val="1"/>
   </w:num>
   <w:num w:numId="25">
-    <w:abstractNumId w:val="2"/>
+    <w:abstractNumId w:val="1"/>
   </w:num>
   <w:num w:numId="26">
-    <w:abstractNumId w:val="2"/>
+    <w:abstractNumId w:val="1"/>
   </w:num>
   <w:num w:numId="27">
-    <w:abstractNumId w:val="2"/>
+    <w:abstractNumId w:val="1"/>
   </w:num>
   <w:num w:numId="28">
-    <w:abstractNumId w:val="2"/>
+    <w:abstractNumId w:val="1"/>
   </w:num>
   <w:num w:numId="29">
-    <w:abstractNumId w:val="2"/>
+    <w:abstractNumId w:val="1"/>
   </w:num>
   <w:num w:numId="30">
-    <w:abstractNumId w:val="2"/>
+    <w:abstractNumId w:val="1"/>
   </w:num>
   <w:num w:numId="31">
-    <w:abstractNumId w:val="2"/>
+    <w:abstractNumId w:val="1"/>
   </w:num>
   <w:num w:numId="32">
-    <w:abstractNumId w:val="2"/>
+    <w:abstractNumId w:val="1"/>
   </w:num>
   <w:num w:numId="33">
-    <w:abstractNumId w:val="2"/>
+    <w:abstractNumId w:val="1"/>
   </w:num>
   <w:num w:numId="34">
-    <w:abstractNumId w:val="2"/>
+    <w:abstractNumId w:val="1"/>
   </w:num>
   <w:num w:numId="35">
-    <w:abstractNumId w:val="2"/>
+    <w:abstractNumId w:val="1"/>
   </w:num>
   <w:num w:numId="36">
-    <w:abstractNumId w:val="2"/>
+    <w:abstractNumId w:val="1"/>
   </w:num>
   <w:num w:numId="37">
-    <w:abstractNumId w:val="2"/>
+    <w:abstractNumId w:val="1"/>
   </w:num>
   <w:num w:numId="38">
-    <w:abstractNumId w:val="2"/>
+    <w:abstractNumId w:val="1"/>
   </w:num>
   <w:num w:numId="39">
-    <w:abstractNumId w:val="2"/>
+    <w:abstractNumId w:val="1"/>
   </w:num>
   <w:num w:numId="40">
-    <w:abstractNumId w:val="2"/>
+    <w:abstractNumId w:val="1"/>
   </w:num>
   <w:num w:numId="41">
-    <w:abstractNumId w:val="2"/>
+    <w:abstractNumId w:val="1"/>
   </w:num>
   <w:num w:numId="42">
-    <w:abstractNumId w:val="2"/>
+    <w:abstractNumId w:val="1"/>
   </w:num>
 </w:numbering>
 </file>
@@ -24764,7 +24689,7 @@
   </w:style>
   <w:style w:type="paragraph" w:styleId="Heading1">
     <w:name w:val="heading 1"/>
-    <w:basedOn w:val="Ttulouser"/>
+    <w:basedOn w:val="Ttulo"/>
     <w:qFormat/>
     <w:pPr>
       <w:spacing w:before="400" w:after="200"/>
@@ -24781,7 +24706,7 @@
   </w:style>
   <w:style w:type="paragraph" w:styleId="Heading2">
     <w:name w:val="heading 2"/>
-    <w:basedOn w:val="Ttulouser"/>
+    <w:basedOn w:val="Ttulo"/>
     <w:qFormat/>
     <w:pPr>
       <w:spacing w:before="300" w:after="150"/>
@@ -24798,7 +24723,7 @@
   </w:style>
   <w:style w:type="paragraph" w:styleId="Heading3">
     <w:name w:val="heading 3"/>
-    <w:basedOn w:val="Ttulouser"/>
+    <w:basedOn w:val="Ttulo"/>
     <w:qFormat/>
     <w:pPr>
       <w:spacing w:before="200" w:after="100"/>
@@ -24815,7 +24740,7 @@
   </w:style>
   <w:style w:type="paragraph" w:styleId="Heading4">
     <w:name w:val="heading 4"/>
-    <w:basedOn w:val="Ttulouser"/>
+    <w:basedOn w:val="Ttulo"/>
     <w:qFormat/>
     <w:pPr/>
     <w:rPr>
@@ -24826,7 +24751,7 @@
   </w:style>
   <w:style w:type="paragraph" w:styleId="Heading5">
     <w:name w:val="heading 5"/>
-    <w:basedOn w:val="Ttulouser"/>
+    <w:basedOn w:val="Ttulo"/>
     <w:qFormat/>
     <w:pPr/>
     <w:rPr>
@@ -24835,7 +24760,7 @@
   </w:style>
   <w:style w:type="paragraph" w:styleId="Heading6">
     <w:name w:val="heading 6"/>
-    <w:basedOn w:val="Ttulouser"/>
+    <w:basedOn w:val="Ttulo"/>
     <w:qFormat/>
     <w:pPr/>
     <w:rPr>
@@ -24851,8 +24776,8 @@
       <w:u w:val="single"/>
     </w:rPr>
   </w:style>
-  <w:style w:type="character" w:styleId="Caracteresdenotaderodapuser">
-    <w:name w:val="Caracteres de nota de rodapé (user)"/>
+  <w:style w:type="character" w:styleId="Caracteresdenotaderodap">
+    <w:name w:val="Caracteres de nota de rodapé"/>
     <w:uiPriority w:val="99"/>
     <w:semiHidden/>
     <w:unhideWhenUsed/>
@@ -24861,8 +24786,8 @@
       <w:vertAlign w:val="superscript"/>
     </w:rPr>
   </w:style>
-  <w:style w:type="character" w:styleId="Caracteresdenotaderodap">
-    <w:name w:val="Caracteres de nota de rodapé"/>
+  <w:style w:type="character" w:styleId="Caracteresdenotaderodapuser">
+    <w:name w:val="Caracteres de nota de rodapé (user)"/>
     <w:qFormat/>
     <w:rPr>
       <w:vertAlign w:val="superscript"/>
@@ -24885,13 +24810,13 @@
       <w:szCs w:val="20"/>
     </w:rPr>
   </w:style>
-  <w:style w:type="character" w:styleId="Vnculodendiceuser">
-    <w:name w:val="Vínculo de índice (user)"/>
+  <w:style w:type="character" w:styleId="Vnculodendice">
+    <w:name w:val="Vínculo de índice"/>
     <w:qFormat/>
     <w:rPr/>
   </w:style>
-  <w:style w:type="character" w:styleId="Vnculodendice">
-    <w:name w:val="Vínculo de índice"/>
+  <w:style w:type="character" w:styleId="Vnculodendiceuser">
+    <w:name w:val="Vínculo de índice (user)"/>
     <w:qFormat/>
     <w:rPr/>
   </w:style>
@@ -24981,7 +24906,7 @@
   </w:style>
   <w:style w:type="paragraph" w:styleId="Title">
     <w:name w:val="Title"/>
-    <w:basedOn w:val="Ttulouser"/>
+    <w:basedOn w:val="Ttulo"/>
     <w:qFormat/>
     <w:pPr/>
     <w:rPr>
@@ -25044,6 +24969,13 @@
       <w:szCs w:val="20"/>
     </w:rPr>
   </w:style>
+  <w:style w:type="paragraph" w:styleId="Cabealhoerodap">
+    <w:name w:val="Cabeçalho e rodapé"/>
+    <w:basedOn w:val="Normal"/>
+    <w:qFormat/>
+    <w:pPr/>
+    <w:rPr/>
+  </w:style>
   <w:style w:type="paragraph" w:styleId="Cabealhoerodapuser">
     <w:name w:val="Cabeçalho e rodapé (user)"/>
     <w:basedOn w:val="Normal"/>
@@ -25051,28 +24983,21 @@
     <w:pPr/>
     <w:rPr/>
   </w:style>
-  <w:style w:type="paragraph" w:styleId="Cabealhoerodap">
-    <w:name w:val="Cabeçalho e rodapé"/>
-    <w:basedOn w:val="Normal"/>
-    <w:qFormat/>
-    <w:pPr/>
-    <w:rPr/>
-  </w:style>
   <w:style w:type="paragraph" w:styleId="Header">
     <w:name w:val="header"/>
-    <w:basedOn w:val="Cabealhoerodapuser"/>
+    <w:basedOn w:val="Cabealhoerodap"/>
     <w:pPr/>
     <w:rPr/>
   </w:style>
   <w:style w:type="paragraph" w:styleId="Footer">
     <w:name w:val="footer"/>
-    <w:basedOn w:val="Cabealhoerodapuser"/>
+    <w:basedOn w:val="Cabealhoerodap"/>
     <w:pPr/>
     <w:rPr/>
   </w:style>
   <w:style w:type="paragraph" w:styleId="IndexHeading">
     <w:name w:val="index heading"/>
-    <w:basedOn w:val="Ttulouser"/>
+    <w:basedOn w:val="Ttulo"/>
     <w:pPr>
       <w:suppressLineNumbers/>
       <w:ind w:hanging="0" w:left="0"/>
@@ -25101,7 +25026,7 @@
   </w:style>
   <w:style w:type="paragraph" w:styleId="TOC1">
     <w:name w:val="toc 1"/>
-    <w:basedOn w:val="ndiceuser"/>
+    <w:basedOn w:val="ndice"/>
     <w:pPr>
       <w:tabs>
         <w:tab w:val="clear" w:pos="720"/>
@@ -25113,7 +25038,7 @@
   </w:style>
   <w:style w:type="paragraph" w:styleId="TOC2">
     <w:name w:val="toc 2"/>
-    <w:basedOn w:val="ndiceuser"/>
+    <w:basedOn w:val="ndice"/>
     <w:pPr>
       <w:tabs>
         <w:tab w:val="clear" w:pos="720"/>

</xml_diff>